<commit_message>
Adding the scrapy notes
</commit_message>
<xml_diff>
--- a/Scraping-By-Python/Scrapy-Notes/Scrapy-Notes-01.docx
+++ b/Scraping-By-Python/Scrapy-Notes/Scrapy-Notes-01.docx
@@ -3191,6 +3191,1764 @@
         </w:rPr>
         <w:t>*******************************************************</w:t>
       </w:r>
+    </w:p>
+    <w:p>
+      <w:pPr>
+        <w:rPr>
+          <w:rFonts w:ascii="Sakkal Majalla" w:hAnsi="Sakkal Majalla" w:cs="Sakkal Majalla"/>
+          <w:sz w:val="28"/>
+          <w:szCs w:val="28"/>
+        </w:rPr>
+      </w:pPr>
+      <w:r>
+        <w:rPr>
+          <w:rFonts w:ascii="Sakkal Majalla" w:hAnsi="Sakkal Majalla" w:cs="Sakkal Majalla"/>
+          <w:sz w:val="28"/>
+          <w:szCs w:val="28"/>
+        </w:rPr>
+        <w:t>In the settings.py file for</w:t>
+      </w:r>
+      <w:r>
+        <w:rPr>
+          <w:rFonts w:ascii="Sakkal Majalla" w:hAnsi="Sakkal Majalla" w:cs="Sakkal Majalla"/>
+          <w:sz w:val="28"/>
+          <w:szCs w:val="28"/>
+        </w:rPr>
+        <w:t xml:space="preserve"> </w:t>
+      </w:r>
+      <w:r>
+        <w:rPr>
+          <w:rFonts w:ascii="Sakkal Majalla" w:hAnsi="Sakkal Majalla" w:cs="Sakkal Majalla"/>
+          <w:sz w:val="28"/>
+          <w:szCs w:val="28"/>
+        </w:rPr>
+        <w:t>saving the output:</w:t>
+      </w:r>
+    </w:p>
+    <w:p>
+      <w:pPr>
+        <w:shd w:val="clear" w:color="auto" w:fill="FFFFFF"/>
+        <w:spacing w:after="0" w:line="285" w:lineRule="atLeast"/>
+        <w:rPr>
+          <w:rFonts w:ascii="Consolas" w:eastAsia="Times New Roman" w:hAnsi="Consolas" w:cs="Times New Roman"/>
+          <w:color w:val="3B3B3B"/>
+          <w:kern w:val="0"/>
+          <w:sz w:val="21"/>
+          <w:szCs w:val="21"/>
+          <w14:ligatures w14:val="none"/>
+        </w:rPr>
+      </w:pPr>
+      <w:r>
+        <w:rPr>
+          <w:rFonts w:ascii="Consolas" w:eastAsia="Times New Roman" w:hAnsi="Consolas" w:cs="Times New Roman"/>
+          <w:color w:val="0070C1"/>
+          <w:kern w:val="0"/>
+          <w:sz w:val="21"/>
+          <w:szCs w:val="21"/>
+          <w14:ligatures w14:val="none"/>
+        </w:rPr>
+        <w:t>FEEDS</w:t>
+      </w:r>
+      <w:r>
+        <w:rPr>
+          <w:rFonts w:ascii="Consolas" w:eastAsia="Times New Roman" w:hAnsi="Consolas" w:cs="Times New Roman"/>
+          <w:color w:val="3B3B3B"/>
+          <w:kern w:val="0"/>
+          <w:sz w:val="21"/>
+          <w:szCs w:val="21"/>
+          <w14:ligatures w14:val="none"/>
+        </w:rPr>
+        <w:t xml:space="preserve"> </w:t>
+      </w:r>
+      <w:r>
+        <w:rPr>
+          <w:rFonts w:ascii="Consolas" w:eastAsia="Times New Roman" w:hAnsi="Consolas" w:cs="Times New Roman"/>
+          <w:color w:val="000000"/>
+          <w:kern w:val="0"/>
+          <w:sz w:val="21"/>
+          <w:szCs w:val="21"/>
+          <w14:ligatures w14:val="none"/>
+        </w:rPr>
+        <w:t>=</w:t>
+      </w:r>
+      <w:r>
+        <w:rPr>
+          <w:rFonts w:ascii="Consolas" w:eastAsia="Times New Roman" w:hAnsi="Consolas" w:cs="Times New Roman"/>
+          <w:color w:val="3B3B3B"/>
+          <w:kern w:val="0"/>
+          <w:sz w:val="21"/>
+          <w:szCs w:val="21"/>
+          <w14:ligatures w14:val="none"/>
+        </w:rPr>
+        <w:t xml:space="preserve"> {</w:t>
+      </w:r>
+    </w:p>
+    <w:p>
+      <w:pPr>
+        <w:shd w:val="clear" w:color="auto" w:fill="FFFFFF"/>
+        <w:spacing w:after="0" w:line="285" w:lineRule="atLeast"/>
+        <w:rPr>
+          <w:rFonts w:ascii="Consolas" w:eastAsia="Times New Roman" w:hAnsi="Consolas" w:cs="Times New Roman"/>
+          <w:color w:val="3B3B3B"/>
+          <w:kern w:val="0"/>
+          <w:sz w:val="21"/>
+          <w:szCs w:val="21"/>
+          <w14:ligatures w14:val="none"/>
+        </w:rPr>
+      </w:pPr>
+      <w:r>
+        <w:rPr>
+          <w:rFonts w:ascii="Consolas" w:eastAsia="Times New Roman" w:hAnsi="Consolas" w:cs="Times New Roman"/>
+          <w:color w:val="3B3B3B"/>
+          <w:kern w:val="0"/>
+          <w:sz w:val="21"/>
+          <w:szCs w:val="21"/>
+          <w14:ligatures w14:val="none"/>
+        </w:rPr>
+        <w:t xml:space="preserve">    </w:t>
+      </w:r>
+      <w:r>
+        <w:rPr>
+          <w:rFonts w:ascii="Consolas" w:eastAsia="Times New Roman" w:hAnsi="Consolas" w:cs="Times New Roman"/>
+          <w:color w:val="A31515"/>
+          <w:kern w:val="0"/>
+          <w:sz w:val="21"/>
+          <w:szCs w:val="21"/>
+          <w14:ligatures w14:val="none"/>
+        </w:rPr>
+        <w:t>"booksdata.json"</w:t>
+      </w:r>
+      <w:r>
+        <w:rPr>
+          <w:rFonts w:ascii="Consolas" w:eastAsia="Times New Roman" w:hAnsi="Consolas" w:cs="Times New Roman"/>
+          <w:color w:val="3B3B3B"/>
+          <w:kern w:val="0"/>
+          <w:sz w:val="21"/>
+          <w:szCs w:val="21"/>
+          <w14:ligatures w14:val="none"/>
+        </w:rPr>
+        <w:t xml:space="preserve">: { </w:t>
+      </w:r>
+      <w:r>
+        <w:rPr>
+          <w:rFonts w:ascii="Consolas" w:eastAsia="Times New Roman" w:hAnsi="Consolas" w:cs="Times New Roman"/>
+          <w:color w:val="A31515"/>
+          <w:kern w:val="0"/>
+          <w:sz w:val="21"/>
+          <w:szCs w:val="21"/>
+          <w14:ligatures w14:val="none"/>
+        </w:rPr>
+        <w:t>'format'</w:t>
+      </w:r>
+      <w:r>
+        <w:rPr>
+          <w:rFonts w:ascii="Consolas" w:eastAsia="Times New Roman" w:hAnsi="Consolas" w:cs="Times New Roman"/>
+          <w:color w:val="3B3B3B"/>
+          <w:kern w:val="0"/>
+          <w:sz w:val="21"/>
+          <w:szCs w:val="21"/>
+          <w14:ligatures w14:val="none"/>
+        </w:rPr>
+        <w:t xml:space="preserve">: </w:t>
+      </w:r>
+      <w:r>
+        <w:rPr>
+          <w:rFonts w:ascii="Consolas" w:eastAsia="Times New Roman" w:hAnsi="Consolas" w:cs="Times New Roman"/>
+          <w:color w:val="A31515"/>
+          <w:kern w:val="0"/>
+          <w:sz w:val="21"/>
+          <w:szCs w:val="21"/>
+          <w14:ligatures w14:val="none"/>
+        </w:rPr>
+        <w:t>'json'</w:t>
+      </w:r>
+      <w:r>
+        <w:rPr>
+          <w:rFonts w:ascii="Consolas" w:eastAsia="Times New Roman" w:hAnsi="Consolas" w:cs="Times New Roman"/>
+          <w:color w:val="3B3B3B"/>
+          <w:kern w:val="0"/>
+          <w:sz w:val="21"/>
+          <w:szCs w:val="21"/>
+          <w14:ligatures w14:val="none"/>
+        </w:rPr>
+        <w:t xml:space="preserve"> }</w:t>
+      </w:r>
+    </w:p>
+    <w:p>
+      <w:pPr>
+        <w:shd w:val="clear" w:color="auto" w:fill="FFFFFF"/>
+        <w:spacing w:after="0" w:line="285" w:lineRule="atLeast"/>
+        <w:rPr>
+          <w:rFonts w:ascii="Consolas" w:eastAsia="Times New Roman" w:hAnsi="Consolas" w:cs="Times New Roman"/>
+          <w:color w:val="3B3B3B"/>
+          <w:kern w:val="0"/>
+          <w:sz w:val="21"/>
+          <w:szCs w:val="21"/>
+          <w14:ligatures w14:val="none"/>
+        </w:rPr>
+      </w:pPr>
+      <w:r>
+        <w:rPr>
+          <w:rFonts w:ascii="Consolas" w:eastAsia="Times New Roman" w:hAnsi="Consolas" w:cs="Times New Roman"/>
+          <w:color w:val="3B3B3B"/>
+          <w:kern w:val="0"/>
+          <w:sz w:val="21"/>
+          <w:szCs w:val="21"/>
+          <w14:ligatures w14:val="none"/>
+        </w:rPr>
+        <w:t>}</w:t>
+      </w:r>
+    </w:p>
+    <w:p>
+      <w:pPr>
+        <w:rPr>
+          <w:rFonts w:ascii="Sakkal Majalla" w:hAnsi="Sakkal Majalla" w:cs="Sakkal Majalla"/>
+          <w:sz w:val="28"/>
+          <w:szCs w:val="28"/>
+        </w:rPr>
+      </w:pPr>
+    </w:p>
+    <w:p>
+      <w:pPr>
+        <w:rPr>
+          <w:rFonts w:ascii="Sakkal Majalla" w:hAnsi="Sakkal Majalla" w:cs="Sakkal Majalla"/>
+          <w:sz w:val="28"/>
+          <w:szCs w:val="28"/>
+        </w:rPr>
+      </w:pPr>
+      <w:r>
+        <w:rPr>
+          <w:rFonts w:ascii="Sakkal Majalla" w:hAnsi="Sakkal Majalla" w:cs="Sakkal Majalla"/>
+          <w:sz w:val="28"/>
+          <w:szCs w:val="28"/>
+        </w:rPr>
+        <w:t>And for the logging, in the spider:</w:t>
+      </w:r>
+    </w:p>
+    <w:p>
+      <w:pPr>
+        <w:shd w:val="clear" w:color="auto" w:fill="FFFFFF"/>
+        <w:spacing w:after="0" w:line="285" w:lineRule="atLeast"/>
+        <w:rPr>
+          <w:rFonts w:ascii="Consolas" w:eastAsia="Times New Roman" w:hAnsi="Consolas" w:cs="Times New Roman"/>
+          <w:color w:val="3B3B3B"/>
+          <w:kern w:val="0"/>
+          <w:sz w:val="21"/>
+          <w:szCs w:val="21"/>
+          <w14:ligatures w14:val="none"/>
+        </w:rPr>
+      </w:pPr>
+      <w:r>
+        <w:rPr>
+          <w:rFonts w:ascii="Consolas" w:eastAsia="Times New Roman" w:hAnsi="Consolas" w:cs="Times New Roman"/>
+          <w:color w:val="001080"/>
+          <w:kern w:val="0"/>
+          <w:sz w:val="21"/>
+          <w:szCs w:val="21"/>
+          <w14:ligatures w14:val="none"/>
+        </w:rPr>
+        <w:t>custom_settings</w:t>
+      </w:r>
+      <w:r>
+        <w:rPr>
+          <w:rFonts w:ascii="Consolas" w:eastAsia="Times New Roman" w:hAnsi="Consolas" w:cs="Times New Roman"/>
+          <w:color w:val="3B3B3B"/>
+          <w:kern w:val="0"/>
+          <w:sz w:val="21"/>
+          <w:szCs w:val="21"/>
+          <w14:ligatures w14:val="none"/>
+        </w:rPr>
+        <w:t xml:space="preserve"> </w:t>
+      </w:r>
+      <w:r>
+        <w:rPr>
+          <w:rFonts w:ascii="Consolas" w:eastAsia="Times New Roman" w:hAnsi="Consolas" w:cs="Times New Roman"/>
+          <w:color w:val="000000"/>
+          <w:kern w:val="0"/>
+          <w:sz w:val="21"/>
+          <w:szCs w:val="21"/>
+          <w14:ligatures w14:val="none"/>
+        </w:rPr>
+        <w:t>=</w:t>
+      </w:r>
+      <w:r>
+        <w:rPr>
+          <w:rFonts w:ascii="Consolas" w:eastAsia="Times New Roman" w:hAnsi="Consolas" w:cs="Times New Roman"/>
+          <w:color w:val="3B3B3B"/>
+          <w:kern w:val="0"/>
+          <w:sz w:val="21"/>
+          <w:szCs w:val="21"/>
+          <w14:ligatures w14:val="none"/>
+        </w:rPr>
+        <w:t xml:space="preserve"> {</w:t>
+      </w:r>
+    </w:p>
+    <w:p>
+      <w:pPr>
+        <w:shd w:val="clear" w:color="auto" w:fill="FFFFFF"/>
+        <w:spacing w:after="0" w:line="285" w:lineRule="atLeast"/>
+        <w:rPr>
+          <w:rFonts w:ascii="Consolas" w:eastAsia="Times New Roman" w:hAnsi="Consolas" w:cs="Times New Roman"/>
+          <w:color w:val="3B3B3B"/>
+          <w:kern w:val="0"/>
+          <w:sz w:val="21"/>
+          <w:szCs w:val="21"/>
+          <w14:ligatures w14:val="none"/>
+        </w:rPr>
+      </w:pPr>
+      <w:r>
+        <w:rPr>
+          <w:rFonts w:ascii="Consolas" w:eastAsia="Times New Roman" w:hAnsi="Consolas" w:cs="Times New Roman"/>
+          <w:color w:val="3B3B3B"/>
+          <w:kern w:val="0"/>
+          <w:sz w:val="21"/>
+          <w:szCs w:val="21"/>
+          <w14:ligatures w14:val="none"/>
+        </w:rPr>
+        <w:t xml:space="preserve">        </w:t>
+      </w:r>
+      <w:r>
+        <w:rPr>
+          <w:rFonts w:ascii="Consolas" w:eastAsia="Times New Roman" w:hAnsi="Consolas" w:cs="Times New Roman"/>
+          <w:color w:val="A31515"/>
+          <w:kern w:val="0"/>
+          <w:sz w:val="21"/>
+          <w:szCs w:val="21"/>
+          <w14:ligatures w14:val="none"/>
+        </w:rPr>
+        <w:t>'LOG_FILE'</w:t>
+      </w:r>
+      <w:r>
+        <w:rPr>
+          <w:rFonts w:ascii="Consolas" w:eastAsia="Times New Roman" w:hAnsi="Consolas" w:cs="Times New Roman"/>
+          <w:color w:val="3B3B3B"/>
+          <w:kern w:val="0"/>
+          <w:sz w:val="21"/>
+          <w:szCs w:val="21"/>
+          <w14:ligatures w14:val="none"/>
+        </w:rPr>
+        <w:t xml:space="preserve">: </w:t>
+      </w:r>
+      <w:r>
+        <w:rPr>
+          <w:rFonts w:ascii="Consolas" w:eastAsia="Times New Roman" w:hAnsi="Consolas" w:cs="Times New Roman"/>
+          <w:color w:val="A31515"/>
+          <w:kern w:val="0"/>
+          <w:sz w:val="21"/>
+          <w:szCs w:val="21"/>
+          <w14:ligatures w14:val="none"/>
+        </w:rPr>
+        <w:t>'result.log'</w:t>
+      </w:r>
+      <w:r>
+        <w:rPr>
+          <w:rFonts w:ascii="Consolas" w:eastAsia="Times New Roman" w:hAnsi="Consolas" w:cs="Times New Roman"/>
+          <w:color w:val="3B3B3B"/>
+          <w:kern w:val="0"/>
+          <w:sz w:val="21"/>
+          <w:szCs w:val="21"/>
+          <w14:ligatures w14:val="none"/>
+        </w:rPr>
+        <w:t>,</w:t>
+      </w:r>
+    </w:p>
+    <w:p>
+      <w:pPr>
+        <w:shd w:val="clear" w:color="auto" w:fill="FFFFFF"/>
+        <w:spacing w:after="0" w:line="285" w:lineRule="atLeast"/>
+        <w:rPr>
+          <w:rFonts w:ascii="Consolas" w:eastAsia="Times New Roman" w:hAnsi="Consolas" w:cs="Times New Roman"/>
+          <w:color w:val="3B3B3B"/>
+          <w:kern w:val="0"/>
+          <w:sz w:val="21"/>
+          <w:szCs w:val="21"/>
+          <w14:ligatures w14:val="none"/>
+        </w:rPr>
+      </w:pPr>
+      <w:r>
+        <w:rPr>
+          <w:rFonts w:ascii="Consolas" w:eastAsia="Times New Roman" w:hAnsi="Consolas" w:cs="Times New Roman"/>
+          <w:color w:val="3B3B3B"/>
+          <w:kern w:val="0"/>
+          <w:sz w:val="21"/>
+          <w:szCs w:val="21"/>
+          <w14:ligatures w14:val="none"/>
+        </w:rPr>
+        <w:t xml:space="preserve">        </w:t>
+      </w:r>
+      <w:r>
+        <w:rPr>
+          <w:rFonts w:ascii="Consolas" w:eastAsia="Times New Roman" w:hAnsi="Consolas" w:cs="Times New Roman"/>
+          <w:color w:val="A31515"/>
+          <w:kern w:val="0"/>
+          <w:sz w:val="21"/>
+          <w:szCs w:val="21"/>
+          <w14:ligatures w14:val="none"/>
+        </w:rPr>
+        <w:t>'LOG_LEVEL'</w:t>
+      </w:r>
+      <w:r>
+        <w:rPr>
+          <w:rFonts w:ascii="Consolas" w:eastAsia="Times New Roman" w:hAnsi="Consolas" w:cs="Times New Roman"/>
+          <w:color w:val="3B3B3B"/>
+          <w:kern w:val="0"/>
+          <w:sz w:val="21"/>
+          <w:szCs w:val="21"/>
+          <w14:ligatures w14:val="none"/>
+        </w:rPr>
+        <w:t xml:space="preserve">: </w:t>
+      </w:r>
+      <w:r>
+        <w:rPr>
+          <w:rFonts w:ascii="Consolas" w:eastAsia="Times New Roman" w:hAnsi="Consolas" w:cs="Times New Roman"/>
+          <w:color w:val="A31515"/>
+          <w:kern w:val="0"/>
+          <w:sz w:val="21"/>
+          <w:szCs w:val="21"/>
+          <w14:ligatures w14:val="none"/>
+        </w:rPr>
+        <w:t>'INFO'</w:t>
+      </w:r>
+    </w:p>
+    <w:p>
+      <w:pPr>
+        <w:shd w:val="clear" w:color="auto" w:fill="FFFFFF"/>
+        <w:spacing w:after="0" w:line="285" w:lineRule="atLeast"/>
+        <w:rPr>
+          <w:rFonts w:ascii="Consolas" w:eastAsia="Times New Roman" w:hAnsi="Consolas" w:cs="Times New Roman"/>
+          <w:color w:val="3B3B3B"/>
+          <w:kern w:val="0"/>
+          <w:sz w:val="21"/>
+          <w:szCs w:val="21"/>
+          <w14:ligatures w14:val="none"/>
+        </w:rPr>
+      </w:pPr>
+      <w:r>
+        <w:rPr>
+          <w:rFonts w:ascii="Consolas" w:eastAsia="Times New Roman" w:hAnsi="Consolas" w:cs="Times New Roman"/>
+          <w:color w:val="3B3B3B"/>
+          <w:kern w:val="0"/>
+          <w:sz w:val="21"/>
+          <w:szCs w:val="21"/>
+          <w14:ligatures w14:val="none"/>
+        </w:rPr>
+        <w:t>    }</w:t>
+      </w:r>
+    </w:p>
+    <w:p>
+      <w:pPr>
+        <w:ind w:left="720" w:firstLine="720"/>
+        <w:rPr>
+          <w:rFonts w:ascii="Sakkal Majalla" w:hAnsi="Sakkal Majalla" w:cs="Sakkal Majalla"/>
+          <w:sz w:val="28"/>
+          <w:szCs w:val="28"/>
+        </w:rPr>
+      </w:pPr>
+      <w:r>
+        <w:rPr>
+          <w:rFonts w:ascii="Sakkal Majalla" w:hAnsi="Sakkal Majalla" w:cs="Sakkal Majalla"/>
+          <w:sz w:val="28"/>
+          <w:szCs w:val="28"/>
+        </w:rPr>
+        <w:t>*******************************************************</w:t>
+      </w:r>
+    </w:p>
+    <w:p>
+      <w:pPr>
+        <w:rPr>
+          <w:rFonts w:ascii="Sakkal Majalla" w:hAnsi="Sakkal Majalla" w:cs="Sakkal Majalla"/>
+          <w:sz w:val="28"/>
+          <w:szCs w:val="28"/>
+        </w:rPr>
+      </w:pPr>
+      <w:r>
+        <w:rPr>
+          <w:rFonts w:ascii="Sakkal Majalla" w:hAnsi="Sakkal Majalla" w:cs="Sakkal Majalla"/>
+          <w:sz w:val="28"/>
+          <w:szCs w:val="28"/>
+        </w:rPr>
+        <w:lastRenderedPageBreak/>
+        <w:t xml:space="preserve">To override the </w:t>
+      </w:r>
+      <w:r>
+        <w:rPr>
+          <w:rFonts w:ascii="Sakkal Majalla" w:hAnsi="Sakkal Majalla" w:cs="Sakkal Majalla"/>
+          <w:b/>
+          <w:bCs/>
+          <w:color w:val="002060"/>
+          <w:sz w:val="28"/>
+          <w:szCs w:val="28"/>
+        </w:rPr>
+        <w:t>settings.py</w:t>
+      </w:r>
+      <w:r>
+        <w:rPr>
+          <w:rFonts w:ascii="Sakkal Majalla" w:hAnsi="Sakkal Majalla" w:cs="Sakkal Majalla"/>
+          <w:color w:val="002060"/>
+          <w:sz w:val="28"/>
+          <w:szCs w:val="28"/>
+        </w:rPr>
+        <w:t xml:space="preserve"> </w:t>
+      </w:r>
+      <w:r>
+        <w:rPr>
+          <w:rFonts w:ascii="Sakkal Majalla" w:hAnsi="Sakkal Majalla" w:cs="Sakkal Majalla"/>
+          <w:sz w:val="28"/>
+          <w:szCs w:val="28"/>
+        </w:rPr>
+        <w:t xml:space="preserve">file configurations, we can use </w:t>
+      </w:r>
+      <w:r>
+        <w:rPr>
+          <w:rFonts w:ascii="Sakkal Majalla" w:hAnsi="Sakkal Majalla" w:cs="Sakkal Majalla"/>
+          <w:b/>
+          <w:bCs/>
+          <w:color w:val="002060"/>
+          <w:sz w:val="28"/>
+          <w:szCs w:val="28"/>
+        </w:rPr>
+        <w:t>custom_settings</w:t>
+      </w:r>
+      <w:r>
+        <w:rPr>
+          <w:rFonts w:ascii="Sakkal Majalla" w:hAnsi="Sakkal Majalla" w:cs="Sakkal Majalla"/>
+          <w:color w:val="002060"/>
+          <w:sz w:val="28"/>
+          <w:szCs w:val="28"/>
+        </w:rPr>
+        <w:t xml:space="preserve"> </w:t>
+      </w:r>
+      <w:r>
+        <w:rPr>
+          <w:rFonts w:ascii="Sakkal Majalla" w:hAnsi="Sakkal Majalla" w:cs="Sakkal Majalla"/>
+          <w:sz w:val="28"/>
+          <w:szCs w:val="28"/>
+        </w:rPr>
+        <w:t>per the spider files</w:t>
+      </w:r>
+      <w:r>
+        <w:rPr>
+          <w:rFonts w:ascii="Sakkal Majalla" w:hAnsi="Sakkal Majalla" w:cs="Sakkal Majalla"/>
+          <w:sz w:val="28"/>
+          <w:szCs w:val="28"/>
+        </w:rPr>
+        <w:t>.</w:t>
+      </w:r>
+    </w:p>
+    <w:p>
+      <w:pPr>
+        <w:ind w:left="720" w:firstLine="720"/>
+        <w:rPr>
+          <w:rFonts w:ascii="Sakkal Majalla" w:hAnsi="Sakkal Majalla" w:cs="Sakkal Majalla"/>
+          <w:sz w:val="28"/>
+          <w:szCs w:val="28"/>
+        </w:rPr>
+      </w:pPr>
+      <w:r>
+        <w:rPr>
+          <w:rFonts w:ascii="Sakkal Majalla" w:hAnsi="Sakkal Majalla" w:cs="Sakkal Majalla"/>
+          <w:sz w:val="28"/>
+          <w:szCs w:val="28"/>
+        </w:rPr>
+        <w:t>*******************************************************</w:t>
+      </w:r>
+    </w:p>
+    <w:p>
+      <w:pPr>
+        <w:shd w:val="clear" w:color="auto" w:fill="FFFFFF"/>
+        <w:spacing w:after="0" w:line="285" w:lineRule="atLeast"/>
+        <w:rPr>
+          <w:rFonts w:ascii="Consolas" w:eastAsia="Times New Roman" w:hAnsi="Consolas" w:cs="Times New Roman"/>
+          <w:color w:val="3B3B3B"/>
+          <w:kern w:val="0"/>
+          <w:sz w:val="21"/>
+          <w:szCs w:val="21"/>
+          <w14:ligatures w14:val="none"/>
+        </w:rPr>
+      </w:pPr>
+      <w:r>
+        <w:rPr>
+          <w:rFonts w:ascii="Consolas" w:eastAsia="Times New Roman" w:hAnsi="Consolas" w:cs="Times New Roman"/>
+          <w:color w:val="001080"/>
+          <w:kern w:val="0"/>
+          <w:sz w:val="21"/>
+          <w:szCs w:val="21"/>
+          <w14:ligatures w14:val="none"/>
+        </w:rPr>
+        <w:t>self</w:t>
+      </w:r>
+      <w:r>
+        <w:rPr>
+          <w:rFonts w:ascii="Consolas" w:eastAsia="Times New Roman" w:hAnsi="Consolas" w:cs="Times New Roman"/>
+          <w:color w:val="3B3B3B"/>
+          <w:kern w:val="0"/>
+          <w:sz w:val="21"/>
+          <w:szCs w:val="21"/>
+          <w14:ligatures w14:val="none"/>
+        </w:rPr>
+        <w:t>.</w:t>
+      </w:r>
+      <w:r>
+        <w:rPr>
+          <w:rFonts w:ascii="Consolas" w:eastAsia="Times New Roman" w:hAnsi="Consolas" w:cs="Times New Roman"/>
+          <w:color w:val="001080"/>
+          <w:kern w:val="0"/>
+          <w:sz w:val="21"/>
+          <w:szCs w:val="21"/>
+          <w14:ligatures w14:val="none"/>
+        </w:rPr>
+        <w:t>conn</w:t>
+      </w:r>
+      <w:r>
+        <w:rPr>
+          <w:rFonts w:ascii="Consolas" w:eastAsia="Times New Roman" w:hAnsi="Consolas" w:cs="Times New Roman"/>
+          <w:color w:val="3B3B3B"/>
+          <w:kern w:val="0"/>
+          <w:sz w:val="21"/>
+          <w:szCs w:val="21"/>
+          <w14:ligatures w14:val="none"/>
+        </w:rPr>
+        <w:t xml:space="preserve"> </w:t>
+      </w:r>
+      <w:r>
+        <w:rPr>
+          <w:rFonts w:ascii="Consolas" w:eastAsia="Times New Roman" w:hAnsi="Consolas" w:cs="Times New Roman"/>
+          <w:color w:val="000000"/>
+          <w:kern w:val="0"/>
+          <w:sz w:val="21"/>
+          <w:szCs w:val="21"/>
+          <w14:ligatures w14:val="none"/>
+        </w:rPr>
+        <w:t>=</w:t>
+      </w:r>
+      <w:r>
+        <w:rPr>
+          <w:rFonts w:ascii="Consolas" w:eastAsia="Times New Roman" w:hAnsi="Consolas" w:cs="Times New Roman"/>
+          <w:color w:val="3B3B3B"/>
+          <w:kern w:val="0"/>
+          <w:sz w:val="21"/>
+          <w:szCs w:val="21"/>
+          <w14:ligatures w14:val="none"/>
+        </w:rPr>
+        <w:t xml:space="preserve"> </w:t>
+      </w:r>
+      <w:r>
+        <w:rPr>
+          <w:rFonts w:ascii="Consolas" w:eastAsia="Times New Roman" w:hAnsi="Consolas" w:cs="Times New Roman"/>
+          <w:color w:val="267F99"/>
+          <w:kern w:val="0"/>
+          <w:sz w:val="21"/>
+          <w:szCs w:val="21"/>
+          <w14:ligatures w14:val="none"/>
+        </w:rPr>
+        <w:t>mysql</w:t>
+      </w:r>
+      <w:r>
+        <w:rPr>
+          <w:rFonts w:ascii="Consolas" w:eastAsia="Times New Roman" w:hAnsi="Consolas" w:cs="Times New Roman"/>
+          <w:color w:val="3B3B3B"/>
+          <w:kern w:val="0"/>
+          <w:sz w:val="21"/>
+          <w:szCs w:val="21"/>
+          <w14:ligatures w14:val="none"/>
+        </w:rPr>
+        <w:t>.connector.connect(</w:t>
+      </w:r>
+    </w:p>
+    <w:p>
+      <w:pPr>
+        <w:shd w:val="clear" w:color="auto" w:fill="FFFFFF"/>
+        <w:spacing w:after="0" w:line="285" w:lineRule="atLeast"/>
+        <w:rPr>
+          <w:rFonts w:ascii="Consolas" w:eastAsia="Times New Roman" w:hAnsi="Consolas" w:cs="Times New Roman"/>
+          <w:color w:val="3B3B3B"/>
+          <w:kern w:val="0"/>
+          <w:sz w:val="21"/>
+          <w:szCs w:val="21"/>
+          <w14:ligatures w14:val="none"/>
+        </w:rPr>
+      </w:pPr>
+      <w:r>
+        <w:rPr>
+          <w:rFonts w:ascii="Consolas" w:eastAsia="Times New Roman" w:hAnsi="Consolas" w:cs="Times New Roman"/>
+          <w:color w:val="3B3B3B"/>
+          <w:kern w:val="0"/>
+          <w:sz w:val="21"/>
+          <w:szCs w:val="21"/>
+          <w14:ligatures w14:val="none"/>
+        </w:rPr>
+        <w:t xml:space="preserve">            </w:t>
+      </w:r>
+      <w:r>
+        <w:rPr>
+          <w:rFonts w:ascii="Consolas" w:eastAsia="Times New Roman" w:hAnsi="Consolas" w:cs="Times New Roman"/>
+          <w:color w:val="001080"/>
+          <w:kern w:val="0"/>
+          <w:sz w:val="21"/>
+          <w:szCs w:val="21"/>
+          <w14:ligatures w14:val="none"/>
+        </w:rPr>
+        <w:t>host</w:t>
+      </w:r>
+      <w:r>
+        <w:rPr>
+          <w:rFonts w:ascii="Consolas" w:eastAsia="Times New Roman" w:hAnsi="Consolas" w:cs="Times New Roman"/>
+          <w:color w:val="3B3B3B"/>
+          <w:kern w:val="0"/>
+          <w:sz w:val="21"/>
+          <w:szCs w:val="21"/>
+          <w14:ligatures w14:val="none"/>
+        </w:rPr>
+        <w:t xml:space="preserve"> </w:t>
+      </w:r>
+      <w:r>
+        <w:rPr>
+          <w:rFonts w:ascii="Consolas" w:eastAsia="Times New Roman" w:hAnsi="Consolas" w:cs="Times New Roman"/>
+          <w:color w:val="000000"/>
+          <w:kern w:val="0"/>
+          <w:sz w:val="21"/>
+          <w:szCs w:val="21"/>
+          <w14:ligatures w14:val="none"/>
+        </w:rPr>
+        <w:t>=</w:t>
+      </w:r>
+      <w:r>
+        <w:rPr>
+          <w:rFonts w:ascii="Consolas" w:eastAsia="Times New Roman" w:hAnsi="Consolas" w:cs="Times New Roman"/>
+          <w:color w:val="3B3B3B"/>
+          <w:kern w:val="0"/>
+          <w:sz w:val="21"/>
+          <w:szCs w:val="21"/>
+          <w14:ligatures w14:val="none"/>
+        </w:rPr>
+        <w:t xml:space="preserve"> </w:t>
+      </w:r>
+      <w:r>
+        <w:rPr>
+          <w:rFonts w:ascii="Consolas" w:eastAsia="Times New Roman" w:hAnsi="Consolas" w:cs="Times New Roman"/>
+          <w:color w:val="A31515"/>
+          <w:kern w:val="0"/>
+          <w:sz w:val="21"/>
+          <w:szCs w:val="21"/>
+          <w14:ligatures w14:val="none"/>
+        </w:rPr>
+        <w:t>'localhost'</w:t>
+      </w:r>
+      <w:r>
+        <w:rPr>
+          <w:rFonts w:ascii="Consolas" w:eastAsia="Times New Roman" w:hAnsi="Consolas" w:cs="Times New Roman"/>
+          <w:color w:val="3B3B3B"/>
+          <w:kern w:val="0"/>
+          <w:sz w:val="21"/>
+          <w:szCs w:val="21"/>
+          <w14:ligatures w14:val="none"/>
+        </w:rPr>
+        <w:t>,</w:t>
+      </w:r>
+    </w:p>
+    <w:p>
+      <w:pPr>
+        <w:shd w:val="clear" w:color="auto" w:fill="FFFFFF"/>
+        <w:spacing w:after="0" w:line="285" w:lineRule="atLeast"/>
+        <w:rPr>
+          <w:rFonts w:ascii="Consolas" w:eastAsia="Times New Roman" w:hAnsi="Consolas" w:cs="Times New Roman"/>
+          <w:color w:val="3B3B3B"/>
+          <w:kern w:val="0"/>
+          <w:sz w:val="21"/>
+          <w:szCs w:val="21"/>
+          <w14:ligatures w14:val="none"/>
+        </w:rPr>
+      </w:pPr>
+      <w:r>
+        <w:rPr>
+          <w:rFonts w:ascii="Consolas" w:eastAsia="Times New Roman" w:hAnsi="Consolas" w:cs="Times New Roman"/>
+          <w:color w:val="3B3B3B"/>
+          <w:kern w:val="0"/>
+          <w:sz w:val="21"/>
+          <w:szCs w:val="21"/>
+          <w14:ligatures w14:val="none"/>
+        </w:rPr>
+        <w:t xml:space="preserve">            </w:t>
+      </w:r>
+      <w:r>
+        <w:rPr>
+          <w:rFonts w:ascii="Consolas" w:eastAsia="Times New Roman" w:hAnsi="Consolas" w:cs="Times New Roman"/>
+          <w:color w:val="001080"/>
+          <w:kern w:val="0"/>
+          <w:sz w:val="21"/>
+          <w:szCs w:val="21"/>
+          <w14:ligatures w14:val="none"/>
+        </w:rPr>
+        <w:t>user</w:t>
+      </w:r>
+      <w:r>
+        <w:rPr>
+          <w:rFonts w:ascii="Consolas" w:eastAsia="Times New Roman" w:hAnsi="Consolas" w:cs="Times New Roman"/>
+          <w:color w:val="3B3B3B"/>
+          <w:kern w:val="0"/>
+          <w:sz w:val="21"/>
+          <w:szCs w:val="21"/>
+          <w14:ligatures w14:val="none"/>
+        </w:rPr>
+        <w:t xml:space="preserve"> </w:t>
+      </w:r>
+      <w:r>
+        <w:rPr>
+          <w:rFonts w:ascii="Consolas" w:eastAsia="Times New Roman" w:hAnsi="Consolas" w:cs="Times New Roman"/>
+          <w:color w:val="000000"/>
+          <w:kern w:val="0"/>
+          <w:sz w:val="21"/>
+          <w:szCs w:val="21"/>
+          <w14:ligatures w14:val="none"/>
+        </w:rPr>
+        <w:t>=</w:t>
+      </w:r>
+      <w:r>
+        <w:rPr>
+          <w:rFonts w:ascii="Consolas" w:eastAsia="Times New Roman" w:hAnsi="Consolas" w:cs="Times New Roman"/>
+          <w:color w:val="3B3B3B"/>
+          <w:kern w:val="0"/>
+          <w:sz w:val="21"/>
+          <w:szCs w:val="21"/>
+          <w14:ligatures w14:val="none"/>
+        </w:rPr>
+        <w:t xml:space="preserve"> </w:t>
+      </w:r>
+      <w:r>
+        <w:rPr>
+          <w:rFonts w:ascii="Consolas" w:eastAsia="Times New Roman" w:hAnsi="Consolas" w:cs="Times New Roman"/>
+          <w:color w:val="A31515"/>
+          <w:kern w:val="0"/>
+          <w:sz w:val="21"/>
+          <w:szCs w:val="21"/>
+          <w14:ligatures w14:val="none"/>
+        </w:rPr>
+        <w:t>'root'</w:t>
+      </w:r>
+      <w:r>
+        <w:rPr>
+          <w:rFonts w:ascii="Consolas" w:eastAsia="Times New Roman" w:hAnsi="Consolas" w:cs="Times New Roman"/>
+          <w:color w:val="3B3B3B"/>
+          <w:kern w:val="0"/>
+          <w:sz w:val="21"/>
+          <w:szCs w:val="21"/>
+          <w14:ligatures w14:val="none"/>
+        </w:rPr>
+        <w:t>,</w:t>
+      </w:r>
+    </w:p>
+    <w:p>
+      <w:pPr>
+        <w:shd w:val="clear" w:color="auto" w:fill="FFFFFF"/>
+        <w:spacing w:after="0" w:line="285" w:lineRule="atLeast"/>
+        <w:rPr>
+          <w:rFonts w:ascii="Consolas" w:eastAsia="Times New Roman" w:hAnsi="Consolas" w:cs="Times New Roman"/>
+          <w:color w:val="3B3B3B"/>
+          <w:kern w:val="0"/>
+          <w:sz w:val="21"/>
+          <w:szCs w:val="21"/>
+          <w14:ligatures w14:val="none"/>
+        </w:rPr>
+      </w:pPr>
+      <w:r>
+        <w:rPr>
+          <w:rFonts w:ascii="Consolas" w:eastAsia="Times New Roman" w:hAnsi="Consolas" w:cs="Times New Roman"/>
+          <w:color w:val="3B3B3B"/>
+          <w:kern w:val="0"/>
+          <w:sz w:val="21"/>
+          <w:szCs w:val="21"/>
+          <w14:ligatures w14:val="none"/>
+        </w:rPr>
+        <w:t xml:space="preserve">            </w:t>
+      </w:r>
+      <w:r>
+        <w:rPr>
+          <w:rFonts w:ascii="Consolas" w:eastAsia="Times New Roman" w:hAnsi="Consolas" w:cs="Times New Roman"/>
+          <w:color w:val="001080"/>
+          <w:kern w:val="0"/>
+          <w:sz w:val="21"/>
+          <w:szCs w:val="21"/>
+          <w14:ligatures w14:val="none"/>
+        </w:rPr>
+        <w:t>password</w:t>
+      </w:r>
+      <w:r>
+        <w:rPr>
+          <w:rFonts w:ascii="Consolas" w:eastAsia="Times New Roman" w:hAnsi="Consolas" w:cs="Times New Roman"/>
+          <w:color w:val="3B3B3B"/>
+          <w:kern w:val="0"/>
+          <w:sz w:val="21"/>
+          <w:szCs w:val="21"/>
+          <w14:ligatures w14:val="none"/>
+        </w:rPr>
+        <w:t xml:space="preserve"> </w:t>
+      </w:r>
+      <w:r>
+        <w:rPr>
+          <w:rFonts w:ascii="Consolas" w:eastAsia="Times New Roman" w:hAnsi="Consolas" w:cs="Times New Roman"/>
+          <w:color w:val="000000"/>
+          <w:kern w:val="0"/>
+          <w:sz w:val="21"/>
+          <w:szCs w:val="21"/>
+          <w14:ligatures w14:val="none"/>
+        </w:rPr>
+        <w:t>=</w:t>
+      </w:r>
+      <w:r>
+        <w:rPr>
+          <w:rFonts w:ascii="Consolas" w:eastAsia="Times New Roman" w:hAnsi="Consolas" w:cs="Times New Roman"/>
+          <w:color w:val="3B3B3B"/>
+          <w:kern w:val="0"/>
+          <w:sz w:val="21"/>
+          <w:szCs w:val="21"/>
+          <w14:ligatures w14:val="none"/>
+        </w:rPr>
+        <w:t xml:space="preserve"> </w:t>
+      </w:r>
+      <w:r>
+        <w:rPr>
+          <w:rFonts w:ascii="Consolas" w:eastAsia="Times New Roman" w:hAnsi="Consolas" w:cs="Times New Roman"/>
+          <w:color w:val="098658"/>
+          <w:kern w:val="0"/>
+          <w:sz w:val="21"/>
+          <w:szCs w:val="21"/>
+          <w14:ligatures w14:val="none"/>
+        </w:rPr>
+        <w:t>123</w:t>
+      </w:r>
+      <w:r>
+        <w:rPr>
+          <w:rFonts w:ascii="Consolas" w:eastAsia="Times New Roman" w:hAnsi="Consolas" w:cs="Times New Roman"/>
+          <w:color w:val="3B3B3B"/>
+          <w:kern w:val="0"/>
+          <w:sz w:val="21"/>
+          <w:szCs w:val="21"/>
+          <w14:ligatures w14:val="none"/>
+        </w:rPr>
+        <w:t>,</w:t>
+      </w:r>
+    </w:p>
+    <w:p>
+      <w:pPr>
+        <w:shd w:val="clear" w:color="auto" w:fill="FFFFFF"/>
+        <w:spacing w:after="0" w:line="285" w:lineRule="atLeast"/>
+        <w:rPr>
+          <w:rFonts w:ascii="Consolas" w:eastAsia="Times New Roman" w:hAnsi="Consolas" w:cs="Times New Roman"/>
+          <w:color w:val="3B3B3B"/>
+          <w:kern w:val="0"/>
+          <w:sz w:val="21"/>
+          <w:szCs w:val="21"/>
+          <w14:ligatures w14:val="none"/>
+        </w:rPr>
+      </w:pPr>
+      <w:r>
+        <w:rPr>
+          <w:rFonts w:ascii="Consolas" w:eastAsia="Times New Roman" w:hAnsi="Consolas" w:cs="Times New Roman"/>
+          <w:color w:val="3B3B3B"/>
+          <w:kern w:val="0"/>
+          <w:sz w:val="21"/>
+          <w:szCs w:val="21"/>
+          <w14:ligatures w14:val="none"/>
+        </w:rPr>
+        <w:t xml:space="preserve">            </w:t>
+      </w:r>
+      <w:r>
+        <w:rPr>
+          <w:rFonts w:ascii="Consolas" w:eastAsia="Times New Roman" w:hAnsi="Consolas" w:cs="Times New Roman"/>
+          <w:color w:val="001080"/>
+          <w:kern w:val="0"/>
+          <w:sz w:val="21"/>
+          <w:szCs w:val="21"/>
+          <w14:ligatures w14:val="none"/>
+        </w:rPr>
+        <w:t>database</w:t>
+      </w:r>
+      <w:r>
+        <w:rPr>
+          <w:rFonts w:ascii="Consolas" w:eastAsia="Times New Roman" w:hAnsi="Consolas" w:cs="Times New Roman"/>
+          <w:color w:val="3B3B3B"/>
+          <w:kern w:val="0"/>
+          <w:sz w:val="21"/>
+          <w:szCs w:val="21"/>
+          <w14:ligatures w14:val="none"/>
+        </w:rPr>
+        <w:t xml:space="preserve"> </w:t>
+      </w:r>
+      <w:r>
+        <w:rPr>
+          <w:rFonts w:ascii="Consolas" w:eastAsia="Times New Roman" w:hAnsi="Consolas" w:cs="Times New Roman"/>
+          <w:color w:val="000000"/>
+          <w:kern w:val="0"/>
+          <w:sz w:val="21"/>
+          <w:szCs w:val="21"/>
+          <w14:ligatures w14:val="none"/>
+        </w:rPr>
+        <w:t>=</w:t>
+      </w:r>
+      <w:r>
+        <w:rPr>
+          <w:rFonts w:ascii="Consolas" w:eastAsia="Times New Roman" w:hAnsi="Consolas" w:cs="Times New Roman"/>
+          <w:color w:val="3B3B3B"/>
+          <w:kern w:val="0"/>
+          <w:sz w:val="21"/>
+          <w:szCs w:val="21"/>
+          <w14:ligatures w14:val="none"/>
+        </w:rPr>
+        <w:t xml:space="preserve"> </w:t>
+      </w:r>
+      <w:r>
+        <w:rPr>
+          <w:rFonts w:ascii="Consolas" w:eastAsia="Times New Roman" w:hAnsi="Consolas" w:cs="Times New Roman"/>
+          <w:color w:val="A31515"/>
+          <w:kern w:val="0"/>
+          <w:sz w:val="21"/>
+          <w:szCs w:val="21"/>
+          <w14:ligatures w14:val="none"/>
+        </w:rPr>
+        <w:t>'scrapebooks'</w:t>
+      </w:r>
+    </w:p>
+    <w:p>
+      <w:pPr>
+        <w:shd w:val="clear" w:color="auto" w:fill="FFFFFF"/>
+        <w:spacing w:after="0" w:line="285" w:lineRule="atLeast"/>
+        <w:rPr>
+          <w:rFonts w:ascii="Consolas" w:eastAsia="Times New Roman" w:hAnsi="Consolas" w:cs="Times New Roman"/>
+          <w:color w:val="3B3B3B"/>
+          <w:kern w:val="0"/>
+          <w:sz w:val="21"/>
+          <w:szCs w:val="21"/>
+          <w14:ligatures w14:val="none"/>
+        </w:rPr>
+      </w:pPr>
+      <w:r>
+        <w:rPr>
+          <w:rFonts w:ascii="Consolas" w:eastAsia="Times New Roman" w:hAnsi="Consolas" w:cs="Times New Roman"/>
+          <w:color w:val="3B3B3B"/>
+          <w:kern w:val="0"/>
+          <w:sz w:val="21"/>
+          <w:szCs w:val="21"/>
+          <w14:ligatures w14:val="none"/>
+        </w:rPr>
+        <w:t>        )</w:t>
+      </w:r>
+    </w:p>
+    <w:p>
+      <w:pPr>
+        <w:shd w:val="clear" w:color="auto" w:fill="FFFFFF"/>
+        <w:spacing w:after="0" w:line="285" w:lineRule="atLeast"/>
+        <w:rPr>
+          <w:rFonts w:ascii="Consolas" w:eastAsia="Times New Roman" w:hAnsi="Consolas" w:cs="Times New Roman"/>
+          <w:color w:val="3B3B3B"/>
+          <w:kern w:val="0"/>
+          <w:sz w:val="21"/>
+          <w:szCs w:val="21"/>
+          <w14:ligatures w14:val="none"/>
+        </w:rPr>
+      </w:pPr>
+    </w:p>
+    <w:p>
+      <w:pPr>
+        <w:shd w:val="clear" w:color="auto" w:fill="FFFFFF"/>
+        <w:spacing w:after="0" w:line="285" w:lineRule="atLeast"/>
+        <w:rPr>
+          <w:rFonts w:ascii="Consolas" w:eastAsia="Times New Roman" w:hAnsi="Consolas" w:cs="Times New Roman"/>
+          <w:color w:val="3B3B3B"/>
+          <w:kern w:val="0"/>
+          <w:sz w:val="21"/>
+          <w:szCs w:val="21"/>
+          <w14:ligatures w14:val="none"/>
+        </w:rPr>
+      </w:pPr>
+      <w:r>
+        <w:rPr>
+          <w:rFonts w:ascii="Consolas" w:eastAsia="Times New Roman" w:hAnsi="Consolas" w:cs="Times New Roman"/>
+          <w:color w:val="3B3B3B"/>
+          <w:kern w:val="0"/>
+          <w:sz w:val="21"/>
+          <w:szCs w:val="21"/>
+          <w14:ligatures w14:val="none"/>
+        </w:rPr>
+        <w:t xml:space="preserve">        </w:t>
+      </w:r>
+      <w:r>
+        <w:rPr>
+          <w:rFonts w:ascii="Consolas" w:eastAsia="Times New Roman" w:hAnsi="Consolas" w:cs="Times New Roman"/>
+          <w:color w:val="001080"/>
+          <w:kern w:val="0"/>
+          <w:sz w:val="21"/>
+          <w:szCs w:val="21"/>
+          <w14:ligatures w14:val="none"/>
+        </w:rPr>
+        <w:t>self</w:t>
+      </w:r>
+      <w:r>
+        <w:rPr>
+          <w:rFonts w:ascii="Consolas" w:eastAsia="Times New Roman" w:hAnsi="Consolas" w:cs="Times New Roman"/>
+          <w:color w:val="3B3B3B"/>
+          <w:kern w:val="0"/>
+          <w:sz w:val="21"/>
+          <w:szCs w:val="21"/>
+          <w14:ligatures w14:val="none"/>
+        </w:rPr>
+        <w:t>.</w:t>
+      </w:r>
+      <w:r>
+        <w:rPr>
+          <w:rFonts w:ascii="Consolas" w:eastAsia="Times New Roman" w:hAnsi="Consolas" w:cs="Times New Roman"/>
+          <w:color w:val="001080"/>
+          <w:kern w:val="0"/>
+          <w:sz w:val="21"/>
+          <w:szCs w:val="21"/>
+          <w14:ligatures w14:val="none"/>
+        </w:rPr>
+        <w:t>cur</w:t>
+      </w:r>
+      <w:r>
+        <w:rPr>
+          <w:rFonts w:ascii="Consolas" w:eastAsia="Times New Roman" w:hAnsi="Consolas" w:cs="Times New Roman"/>
+          <w:color w:val="3B3B3B"/>
+          <w:kern w:val="0"/>
+          <w:sz w:val="21"/>
+          <w:szCs w:val="21"/>
+          <w14:ligatures w14:val="none"/>
+        </w:rPr>
+        <w:t xml:space="preserve"> </w:t>
+      </w:r>
+      <w:r>
+        <w:rPr>
+          <w:rFonts w:ascii="Consolas" w:eastAsia="Times New Roman" w:hAnsi="Consolas" w:cs="Times New Roman"/>
+          <w:color w:val="000000"/>
+          <w:kern w:val="0"/>
+          <w:sz w:val="21"/>
+          <w:szCs w:val="21"/>
+          <w14:ligatures w14:val="none"/>
+        </w:rPr>
+        <w:t>=</w:t>
+      </w:r>
+      <w:r>
+        <w:rPr>
+          <w:rFonts w:ascii="Consolas" w:eastAsia="Times New Roman" w:hAnsi="Consolas" w:cs="Times New Roman"/>
+          <w:color w:val="3B3B3B"/>
+          <w:kern w:val="0"/>
+          <w:sz w:val="21"/>
+          <w:szCs w:val="21"/>
+          <w14:ligatures w14:val="none"/>
+        </w:rPr>
+        <w:t xml:space="preserve"> </w:t>
+      </w:r>
+      <w:r>
+        <w:rPr>
+          <w:rFonts w:ascii="Consolas" w:eastAsia="Times New Roman" w:hAnsi="Consolas" w:cs="Times New Roman"/>
+          <w:color w:val="001080"/>
+          <w:kern w:val="0"/>
+          <w:sz w:val="21"/>
+          <w:szCs w:val="21"/>
+          <w14:ligatures w14:val="none"/>
+        </w:rPr>
+        <w:t>self</w:t>
+      </w:r>
+      <w:r>
+        <w:rPr>
+          <w:rFonts w:ascii="Consolas" w:eastAsia="Times New Roman" w:hAnsi="Consolas" w:cs="Times New Roman"/>
+          <w:color w:val="3B3B3B"/>
+          <w:kern w:val="0"/>
+          <w:sz w:val="21"/>
+          <w:szCs w:val="21"/>
+          <w14:ligatures w14:val="none"/>
+        </w:rPr>
+        <w:t>.</w:t>
+      </w:r>
+      <w:r>
+        <w:rPr>
+          <w:rFonts w:ascii="Consolas" w:eastAsia="Times New Roman" w:hAnsi="Consolas" w:cs="Times New Roman"/>
+          <w:color w:val="001080"/>
+          <w:kern w:val="0"/>
+          <w:sz w:val="21"/>
+          <w:szCs w:val="21"/>
+          <w14:ligatures w14:val="none"/>
+        </w:rPr>
+        <w:t>conn</w:t>
+      </w:r>
+      <w:r>
+        <w:rPr>
+          <w:rFonts w:ascii="Consolas" w:eastAsia="Times New Roman" w:hAnsi="Consolas" w:cs="Times New Roman"/>
+          <w:color w:val="3B3B3B"/>
+          <w:kern w:val="0"/>
+          <w:sz w:val="21"/>
+          <w:szCs w:val="21"/>
+          <w14:ligatures w14:val="none"/>
+        </w:rPr>
+        <w:t>.cursor()</w:t>
+      </w:r>
+    </w:p>
+    <w:p>
+      <w:pPr>
+        <w:shd w:val="clear" w:color="auto" w:fill="FFFFFF"/>
+        <w:spacing w:after="0" w:line="285" w:lineRule="atLeast"/>
+        <w:rPr>
+          <w:rFonts w:ascii="Consolas" w:eastAsia="Times New Roman" w:hAnsi="Consolas" w:cs="Times New Roman"/>
+          <w:color w:val="3B3B3B"/>
+          <w:kern w:val="0"/>
+          <w:sz w:val="21"/>
+          <w:szCs w:val="21"/>
+          <w14:ligatures w14:val="none"/>
+        </w:rPr>
+      </w:pPr>
+      <w:r>
+        <w:rPr>
+          <w:rFonts w:ascii="Consolas" w:eastAsia="Times New Roman" w:hAnsi="Consolas" w:cs="Times New Roman"/>
+          <w:color w:val="3B3B3B"/>
+          <w:kern w:val="0"/>
+          <w:sz w:val="21"/>
+          <w:szCs w:val="21"/>
+          <w14:ligatures w14:val="none"/>
+        </w:rPr>
+        <w:t xml:space="preserve">        </w:t>
+      </w:r>
+      <w:r>
+        <w:rPr>
+          <w:rFonts w:ascii="Consolas" w:eastAsia="Times New Roman" w:hAnsi="Consolas" w:cs="Times New Roman"/>
+          <w:color w:val="001080"/>
+          <w:kern w:val="0"/>
+          <w:sz w:val="21"/>
+          <w:szCs w:val="21"/>
+          <w14:ligatures w14:val="none"/>
+        </w:rPr>
+        <w:t>self</w:t>
+      </w:r>
+      <w:r>
+        <w:rPr>
+          <w:rFonts w:ascii="Consolas" w:eastAsia="Times New Roman" w:hAnsi="Consolas" w:cs="Times New Roman"/>
+          <w:color w:val="3B3B3B"/>
+          <w:kern w:val="0"/>
+          <w:sz w:val="21"/>
+          <w:szCs w:val="21"/>
+          <w14:ligatures w14:val="none"/>
+        </w:rPr>
+        <w:t>.</w:t>
+      </w:r>
+      <w:r>
+        <w:rPr>
+          <w:rFonts w:ascii="Consolas" w:eastAsia="Times New Roman" w:hAnsi="Consolas" w:cs="Times New Roman"/>
+          <w:color w:val="001080"/>
+          <w:kern w:val="0"/>
+          <w:sz w:val="21"/>
+          <w:szCs w:val="21"/>
+          <w14:ligatures w14:val="none"/>
+        </w:rPr>
+        <w:t>cur</w:t>
+      </w:r>
+      <w:r>
+        <w:rPr>
+          <w:rFonts w:ascii="Consolas" w:eastAsia="Times New Roman" w:hAnsi="Consolas" w:cs="Times New Roman"/>
+          <w:color w:val="3B3B3B"/>
+          <w:kern w:val="0"/>
+          <w:sz w:val="21"/>
+          <w:szCs w:val="21"/>
+          <w14:ligatures w14:val="none"/>
+        </w:rPr>
+        <w:t>.execute(</w:t>
+      </w:r>
+      <w:r>
+        <w:rPr>
+          <w:rFonts w:ascii="Consolas" w:eastAsia="Times New Roman" w:hAnsi="Consolas" w:cs="Times New Roman"/>
+          <w:color w:val="A31515"/>
+          <w:kern w:val="0"/>
+          <w:sz w:val="21"/>
+          <w:szCs w:val="21"/>
+          <w14:ligatures w14:val="none"/>
+        </w:rPr>
+        <w:t>"""</w:t>
+      </w:r>
+    </w:p>
+    <w:p>
+      <w:pPr>
+        <w:shd w:val="clear" w:color="auto" w:fill="FFFFFF"/>
+        <w:spacing w:after="0" w:line="285" w:lineRule="atLeast"/>
+        <w:rPr>
+          <w:rFonts w:ascii="Consolas" w:eastAsia="Times New Roman" w:hAnsi="Consolas" w:cs="Times New Roman"/>
+          <w:color w:val="3B3B3B"/>
+          <w:kern w:val="0"/>
+          <w:sz w:val="21"/>
+          <w:szCs w:val="21"/>
+          <w14:ligatures w14:val="none"/>
+        </w:rPr>
+      </w:pPr>
+      <w:r>
+        <w:rPr>
+          <w:rFonts w:ascii="Consolas" w:eastAsia="Times New Roman" w:hAnsi="Consolas" w:cs="Times New Roman"/>
+          <w:color w:val="A31515"/>
+          <w:kern w:val="0"/>
+          <w:sz w:val="21"/>
+          <w:szCs w:val="21"/>
+          <w14:ligatures w14:val="none"/>
+        </w:rPr>
+        <w:t>            CREATE TABLE IF NOT EXISTS books (</w:t>
+      </w:r>
+    </w:p>
+    <w:p>
+      <w:pPr>
+        <w:shd w:val="clear" w:color="auto" w:fill="FFFFFF"/>
+        <w:spacing w:after="0" w:line="285" w:lineRule="atLeast"/>
+        <w:rPr>
+          <w:rFonts w:ascii="Consolas" w:eastAsia="Times New Roman" w:hAnsi="Consolas" w:cs="Times New Roman"/>
+          <w:color w:val="3B3B3B"/>
+          <w:kern w:val="0"/>
+          <w:sz w:val="21"/>
+          <w:szCs w:val="21"/>
+          <w14:ligatures w14:val="none"/>
+        </w:rPr>
+      </w:pPr>
+      <w:r>
+        <w:rPr>
+          <w:rFonts w:ascii="Consolas" w:eastAsia="Times New Roman" w:hAnsi="Consolas" w:cs="Times New Roman"/>
+          <w:color w:val="A31515"/>
+          <w:kern w:val="0"/>
+          <w:sz w:val="21"/>
+          <w:szCs w:val="21"/>
+          <w14:ligatures w14:val="none"/>
+        </w:rPr>
+        <w:t>                id INT AUTO_INCREMENT PRIMARY KEY,</w:t>
+      </w:r>
+    </w:p>
+    <w:p>
+      <w:pPr>
+        <w:shd w:val="clear" w:color="auto" w:fill="FFFFFF"/>
+        <w:spacing w:after="0" w:line="285" w:lineRule="atLeast"/>
+        <w:rPr>
+          <w:rFonts w:ascii="Consolas" w:eastAsia="Times New Roman" w:hAnsi="Consolas" w:cs="Times New Roman"/>
+          <w:color w:val="3B3B3B"/>
+          <w:kern w:val="0"/>
+          <w:sz w:val="21"/>
+          <w:szCs w:val="21"/>
+          <w14:ligatures w14:val="none"/>
+        </w:rPr>
+      </w:pPr>
+      <w:r>
+        <w:rPr>
+          <w:rFonts w:ascii="Consolas" w:eastAsia="Times New Roman" w:hAnsi="Consolas" w:cs="Times New Roman"/>
+          <w:color w:val="A31515"/>
+          <w:kern w:val="0"/>
+          <w:sz w:val="21"/>
+          <w:szCs w:val="21"/>
+          <w14:ligatures w14:val="none"/>
+        </w:rPr>
+        <w:t>                url VARCHAR(1024) UNIQUE NOT NULL,</w:t>
+      </w:r>
+    </w:p>
+    <w:p>
+      <w:pPr>
+        <w:shd w:val="clear" w:color="auto" w:fill="FFFFFF"/>
+        <w:spacing w:after="0" w:line="285" w:lineRule="atLeast"/>
+        <w:rPr>
+          <w:rFonts w:ascii="Consolas" w:eastAsia="Times New Roman" w:hAnsi="Consolas" w:cs="Times New Roman"/>
+          <w:color w:val="3B3B3B"/>
+          <w:kern w:val="0"/>
+          <w:sz w:val="21"/>
+          <w:szCs w:val="21"/>
+          <w14:ligatures w14:val="none"/>
+        </w:rPr>
+      </w:pPr>
+      <w:r>
+        <w:rPr>
+          <w:rFonts w:ascii="Consolas" w:eastAsia="Times New Roman" w:hAnsi="Consolas" w:cs="Times New Roman"/>
+          <w:color w:val="A31515"/>
+          <w:kern w:val="0"/>
+          <w:sz w:val="21"/>
+          <w:szCs w:val="21"/>
+          <w14:ligatures w14:val="none"/>
+        </w:rPr>
+        <w:t>                title VARCHAR(255),</w:t>
+      </w:r>
+    </w:p>
+    <w:p>
+      <w:pPr>
+        <w:shd w:val="clear" w:color="auto" w:fill="FFFFFF"/>
+        <w:spacing w:after="0" w:line="285" w:lineRule="atLeast"/>
+        <w:rPr>
+          <w:rFonts w:ascii="Consolas" w:eastAsia="Times New Roman" w:hAnsi="Consolas" w:cs="Times New Roman"/>
+          <w:color w:val="3B3B3B"/>
+          <w:kern w:val="0"/>
+          <w:sz w:val="21"/>
+          <w:szCs w:val="21"/>
+          <w14:ligatures w14:val="none"/>
+        </w:rPr>
+      </w:pPr>
+      <w:r>
+        <w:rPr>
+          <w:rFonts w:ascii="Consolas" w:eastAsia="Times New Roman" w:hAnsi="Consolas" w:cs="Times New Roman"/>
+          <w:color w:val="A31515"/>
+          <w:kern w:val="0"/>
+          <w:sz w:val="21"/>
+          <w:szCs w:val="21"/>
+          <w14:ligatures w14:val="none"/>
+        </w:rPr>
+        <w:t>                product_type VARCHAR(100),</w:t>
+      </w:r>
+    </w:p>
+    <w:p>
+      <w:pPr>
+        <w:shd w:val="clear" w:color="auto" w:fill="FFFFFF"/>
+        <w:spacing w:after="0" w:line="285" w:lineRule="atLeast"/>
+        <w:rPr>
+          <w:rFonts w:ascii="Consolas" w:eastAsia="Times New Roman" w:hAnsi="Consolas" w:cs="Times New Roman"/>
+          <w:color w:val="3B3B3B"/>
+          <w:kern w:val="0"/>
+          <w:sz w:val="21"/>
+          <w:szCs w:val="21"/>
+          <w14:ligatures w14:val="none"/>
+        </w:rPr>
+      </w:pPr>
+      <w:r>
+        <w:rPr>
+          <w:rFonts w:ascii="Consolas" w:eastAsia="Times New Roman" w:hAnsi="Consolas" w:cs="Times New Roman"/>
+          <w:color w:val="A31515"/>
+          <w:kern w:val="0"/>
+          <w:sz w:val="21"/>
+          <w:szCs w:val="21"/>
+          <w14:ligatures w14:val="none"/>
+        </w:rPr>
+        <w:t>                price_excl_tax DECIMAL(10, 2),</w:t>
+      </w:r>
+    </w:p>
+    <w:p>
+      <w:pPr>
+        <w:shd w:val="clear" w:color="auto" w:fill="FFFFFF"/>
+        <w:spacing w:after="0" w:line="285" w:lineRule="atLeast"/>
+        <w:rPr>
+          <w:rFonts w:ascii="Consolas" w:eastAsia="Times New Roman" w:hAnsi="Consolas" w:cs="Times New Roman"/>
+          <w:color w:val="3B3B3B"/>
+          <w:kern w:val="0"/>
+          <w:sz w:val="21"/>
+          <w:szCs w:val="21"/>
+          <w14:ligatures w14:val="none"/>
+        </w:rPr>
+      </w:pPr>
+      <w:r>
+        <w:rPr>
+          <w:rFonts w:ascii="Consolas" w:eastAsia="Times New Roman" w:hAnsi="Consolas" w:cs="Times New Roman"/>
+          <w:color w:val="A31515"/>
+          <w:kern w:val="0"/>
+          <w:sz w:val="21"/>
+          <w:szCs w:val="21"/>
+          <w14:ligatures w14:val="none"/>
+        </w:rPr>
+        <w:t>                price_incl_tax DECIMAL(10, 2),</w:t>
+      </w:r>
+    </w:p>
+    <w:p>
+      <w:pPr>
+        <w:shd w:val="clear" w:color="auto" w:fill="FFFFFF"/>
+        <w:spacing w:after="0" w:line="285" w:lineRule="atLeast"/>
+        <w:rPr>
+          <w:rFonts w:ascii="Consolas" w:eastAsia="Times New Roman" w:hAnsi="Consolas" w:cs="Times New Roman"/>
+          <w:color w:val="3B3B3B"/>
+          <w:kern w:val="0"/>
+          <w:sz w:val="21"/>
+          <w:szCs w:val="21"/>
+          <w14:ligatures w14:val="none"/>
+        </w:rPr>
+      </w:pPr>
+      <w:r>
+        <w:rPr>
+          <w:rFonts w:ascii="Consolas" w:eastAsia="Times New Roman" w:hAnsi="Consolas" w:cs="Times New Roman"/>
+          <w:color w:val="A31515"/>
+          <w:kern w:val="0"/>
+          <w:sz w:val="21"/>
+          <w:szCs w:val="21"/>
+          <w14:ligatures w14:val="none"/>
+        </w:rPr>
+        <w:t>                tax DECIMAL(10, 2),</w:t>
+      </w:r>
+    </w:p>
+    <w:p>
+      <w:pPr>
+        <w:shd w:val="clear" w:color="auto" w:fill="FFFFFF"/>
+        <w:spacing w:after="0" w:line="285" w:lineRule="atLeast"/>
+        <w:rPr>
+          <w:rFonts w:ascii="Consolas" w:eastAsia="Times New Roman" w:hAnsi="Consolas" w:cs="Times New Roman"/>
+          <w:color w:val="3B3B3B"/>
+          <w:kern w:val="0"/>
+          <w:sz w:val="21"/>
+          <w:szCs w:val="21"/>
+          <w14:ligatures w14:val="none"/>
+        </w:rPr>
+      </w:pPr>
+      <w:r>
+        <w:rPr>
+          <w:rFonts w:ascii="Consolas" w:eastAsia="Times New Roman" w:hAnsi="Consolas" w:cs="Times New Roman"/>
+          <w:color w:val="A31515"/>
+          <w:kern w:val="0"/>
+          <w:sz w:val="21"/>
+          <w:szCs w:val="21"/>
+          <w14:ligatures w14:val="none"/>
+        </w:rPr>
+        <w:t>                availability VARCHAR(100),</w:t>
+      </w:r>
+    </w:p>
+    <w:p>
+      <w:pPr>
+        <w:shd w:val="clear" w:color="auto" w:fill="FFFFFF"/>
+        <w:spacing w:after="0" w:line="285" w:lineRule="atLeast"/>
+        <w:rPr>
+          <w:rFonts w:ascii="Consolas" w:eastAsia="Times New Roman" w:hAnsi="Consolas" w:cs="Times New Roman"/>
+          <w:color w:val="3B3B3B"/>
+          <w:kern w:val="0"/>
+          <w:sz w:val="21"/>
+          <w:szCs w:val="21"/>
+          <w14:ligatures w14:val="none"/>
+        </w:rPr>
+      </w:pPr>
+      <w:r>
+        <w:rPr>
+          <w:rFonts w:ascii="Consolas" w:eastAsia="Times New Roman" w:hAnsi="Consolas" w:cs="Times New Roman"/>
+          <w:color w:val="A31515"/>
+          <w:kern w:val="0"/>
+          <w:sz w:val="21"/>
+          <w:szCs w:val="21"/>
+          <w14:ligatures w14:val="none"/>
+        </w:rPr>
+        <w:t>                num_reviews INT,</w:t>
+      </w:r>
+    </w:p>
+    <w:p>
+      <w:pPr>
+        <w:shd w:val="clear" w:color="auto" w:fill="FFFFFF"/>
+        <w:spacing w:after="0" w:line="285" w:lineRule="atLeast"/>
+        <w:rPr>
+          <w:rFonts w:ascii="Consolas" w:eastAsia="Times New Roman" w:hAnsi="Consolas" w:cs="Times New Roman"/>
+          <w:color w:val="3B3B3B"/>
+          <w:kern w:val="0"/>
+          <w:sz w:val="21"/>
+          <w:szCs w:val="21"/>
+          <w14:ligatures w14:val="none"/>
+        </w:rPr>
+      </w:pPr>
+      <w:r>
+        <w:rPr>
+          <w:rFonts w:ascii="Consolas" w:eastAsia="Times New Roman" w:hAnsi="Consolas" w:cs="Times New Roman"/>
+          <w:color w:val="A31515"/>
+          <w:kern w:val="0"/>
+          <w:sz w:val="21"/>
+          <w:szCs w:val="21"/>
+          <w14:ligatures w14:val="none"/>
+        </w:rPr>
+        <w:t>                stars VARCHAR(50),</w:t>
+      </w:r>
+    </w:p>
+    <w:p>
+      <w:pPr>
+        <w:shd w:val="clear" w:color="auto" w:fill="FFFFFF"/>
+        <w:spacing w:after="0" w:line="285" w:lineRule="atLeast"/>
+        <w:rPr>
+          <w:rFonts w:ascii="Consolas" w:eastAsia="Times New Roman" w:hAnsi="Consolas" w:cs="Times New Roman"/>
+          <w:color w:val="3B3B3B"/>
+          <w:kern w:val="0"/>
+          <w:sz w:val="21"/>
+          <w:szCs w:val="21"/>
+          <w14:ligatures w14:val="none"/>
+        </w:rPr>
+      </w:pPr>
+      <w:r>
+        <w:rPr>
+          <w:rFonts w:ascii="Consolas" w:eastAsia="Times New Roman" w:hAnsi="Consolas" w:cs="Times New Roman"/>
+          <w:color w:val="A31515"/>
+          <w:kern w:val="0"/>
+          <w:sz w:val="21"/>
+          <w:szCs w:val="21"/>
+          <w14:ligatures w14:val="none"/>
+        </w:rPr>
+        <w:t>                category VARCHAR(100),</w:t>
+      </w:r>
+    </w:p>
+    <w:p>
+      <w:pPr>
+        <w:shd w:val="clear" w:color="auto" w:fill="FFFFFF"/>
+        <w:spacing w:after="0" w:line="285" w:lineRule="atLeast"/>
+        <w:rPr>
+          <w:rFonts w:ascii="Consolas" w:eastAsia="Times New Roman" w:hAnsi="Consolas" w:cs="Times New Roman"/>
+          <w:color w:val="3B3B3B"/>
+          <w:kern w:val="0"/>
+          <w:sz w:val="21"/>
+          <w:szCs w:val="21"/>
+          <w14:ligatures w14:val="none"/>
+        </w:rPr>
+      </w:pPr>
+      <w:r>
+        <w:rPr>
+          <w:rFonts w:ascii="Consolas" w:eastAsia="Times New Roman" w:hAnsi="Consolas" w:cs="Times New Roman"/>
+          <w:color w:val="A31515"/>
+          <w:kern w:val="0"/>
+          <w:sz w:val="21"/>
+          <w:szCs w:val="21"/>
+          <w14:ligatures w14:val="none"/>
+        </w:rPr>
+        <w:t>                description TEXT,</w:t>
+      </w:r>
+    </w:p>
+    <w:p>
+      <w:pPr>
+        <w:shd w:val="clear" w:color="auto" w:fill="FFFFFF"/>
+        <w:spacing w:after="0" w:line="285" w:lineRule="atLeast"/>
+        <w:rPr>
+          <w:rFonts w:ascii="Consolas" w:eastAsia="Times New Roman" w:hAnsi="Consolas" w:cs="Times New Roman"/>
+          <w:color w:val="3B3B3B"/>
+          <w:kern w:val="0"/>
+          <w:sz w:val="21"/>
+          <w:szCs w:val="21"/>
+          <w14:ligatures w14:val="none"/>
+        </w:rPr>
+      </w:pPr>
+      <w:r>
+        <w:rPr>
+          <w:rFonts w:ascii="Consolas" w:eastAsia="Times New Roman" w:hAnsi="Consolas" w:cs="Times New Roman"/>
+          <w:color w:val="A31515"/>
+          <w:kern w:val="0"/>
+          <w:sz w:val="21"/>
+          <w:szCs w:val="21"/>
+          <w14:ligatures w14:val="none"/>
+        </w:rPr>
+        <w:t>                price DECIMAL(10, 2),</w:t>
+      </w:r>
+    </w:p>
+    <w:p>
+      <w:pPr>
+        <w:shd w:val="clear" w:color="auto" w:fill="FFFFFF"/>
+        <w:spacing w:after="0" w:line="285" w:lineRule="atLeast"/>
+        <w:rPr>
+          <w:rFonts w:ascii="Consolas" w:eastAsia="Times New Roman" w:hAnsi="Consolas" w:cs="Times New Roman"/>
+          <w:color w:val="3B3B3B"/>
+          <w:kern w:val="0"/>
+          <w:sz w:val="21"/>
+          <w:szCs w:val="21"/>
+          <w14:ligatures w14:val="none"/>
+        </w:rPr>
+      </w:pPr>
+      <w:r>
+        <w:rPr>
+          <w:rFonts w:ascii="Consolas" w:eastAsia="Times New Roman" w:hAnsi="Consolas" w:cs="Times New Roman"/>
+          <w:color w:val="A31515"/>
+          <w:kern w:val="0"/>
+          <w:sz w:val="21"/>
+          <w:szCs w:val="21"/>
+          <w14:ligatures w14:val="none"/>
+        </w:rPr>
+        <w:t>                created_at TIMESTAMP DEFAULT CURRENT_TIMESTAMP,</w:t>
+      </w:r>
+    </w:p>
+    <w:p>
+      <w:pPr>
+        <w:shd w:val="clear" w:color="auto" w:fill="FFFFFF"/>
+        <w:spacing w:after="0" w:line="285" w:lineRule="atLeast"/>
+        <w:rPr>
+          <w:rFonts w:ascii="Consolas" w:eastAsia="Times New Roman" w:hAnsi="Consolas" w:cs="Times New Roman"/>
+          <w:color w:val="3B3B3B"/>
+          <w:kern w:val="0"/>
+          <w:sz w:val="21"/>
+          <w:szCs w:val="21"/>
+          <w14:ligatures w14:val="none"/>
+        </w:rPr>
+      </w:pPr>
+      <w:r>
+        <w:rPr>
+          <w:rFonts w:ascii="Consolas" w:eastAsia="Times New Roman" w:hAnsi="Consolas" w:cs="Times New Roman"/>
+          <w:color w:val="A31515"/>
+          <w:kern w:val="0"/>
+          <w:sz w:val="21"/>
+          <w:szCs w:val="21"/>
+          <w14:ligatures w14:val="none"/>
+        </w:rPr>
+        <w:t>                updated_at TIMESTAMP DEFAULT CURRENT_TIMESTAMP ON UPDATE CURRENT_TIMESTAMP</w:t>
+      </w:r>
+    </w:p>
+    <w:p>
+      <w:pPr>
+        <w:shd w:val="clear" w:color="auto" w:fill="FFFFFF"/>
+        <w:spacing w:after="0" w:line="285" w:lineRule="atLeast"/>
+        <w:rPr>
+          <w:rFonts w:ascii="Consolas" w:eastAsia="Times New Roman" w:hAnsi="Consolas" w:cs="Times New Roman"/>
+          <w:color w:val="3B3B3B"/>
+          <w:kern w:val="0"/>
+          <w:sz w:val="21"/>
+          <w:szCs w:val="21"/>
+          <w14:ligatures w14:val="none"/>
+        </w:rPr>
+      </w:pPr>
+      <w:r>
+        <w:rPr>
+          <w:rFonts w:ascii="Consolas" w:eastAsia="Times New Roman" w:hAnsi="Consolas" w:cs="Times New Roman"/>
+          <w:color w:val="A31515"/>
+          <w:kern w:val="0"/>
+          <w:sz w:val="21"/>
+          <w:szCs w:val="21"/>
+          <w14:ligatures w14:val="none"/>
+        </w:rPr>
+        <w:t>            ) ENGINE=InnoDB DEFAULT CHARSET=utf8mb4 COLLATE=utf8mb4_unicode_ci;</w:t>
+      </w:r>
+    </w:p>
+    <w:p>
+      <w:pPr>
+        <w:shd w:val="clear" w:color="auto" w:fill="FFFFFF"/>
+        <w:spacing w:after="0" w:line="285" w:lineRule="atLeast"/>
+        <w:rPr>
+          <w:rFonts w:ascii="Consolas" w:eastAsia="Times New Roman" w:hAnsi="Consolas" w:cs="Times New Roman"/>
+          <w:color w:val="3B3B3B"/>
+          <w:kern w:val="0"/>
+          <w:sz w:val="21"/>
+          <w:szCs w:val="21"/>
+          <w14:ligatures w14:val="none"/>
+        </w:rPr>
+      </w:pPr>
+      <w:r>
+        <w:rPr>
+          <w:rFonts w:ascii="Consolas" w:eastAsia="Times New Roman" w:hAnsi="Consolas" w:cs="Times New Roman"/>
+          <w:color w:val="A31515"/>
+          <w:kern w:val="0"/>
+          <w:sz w:val="21"/>
+          <w:szCs w:val="21"/>
+          <w14:ligatures w14:val="none"/>
+        </w:rPr>
+        <w:t>"""</w:t>
+      </w:r>
+      <w:r>
+        <w:rPr>
+          <w:rFonts w:ascii="Consolas" w:eastAsia="Times New Roman" w:hAnsi="Consolas" w:cs="Times New Roman"/>
+          <w:color w:val="3B3B3B"/>
+          <w:kern w:val="0"/>
+          <w:sz w:val="21"/>
+          <w:szCs w:val="21"/>
+          <w14:ligatures w14:val="none"/>
+        </w:rPr>
+        <w:t>)</w:t>
+      </w:r>
+    </w:p>
+    <w:p>
+      <w:pPr>
+        <w:ind w:left="720" w:firstLine="720"/>
+        <w:rPr>
+          <w:rFonts w:ascii="Sakkal Majalla" w:hAnsi="Sakkal Majalla" w:cs="Sakkal Majalla"/>
+          <w:sz w:val="28"/>
+          <w:szCs w:val="28"/>
+        </w:rPr>
+      </w:pPr>
+      <w:r>
+        <w:rPr>
+          <w:rFonts w:ascii="Sakkal Majalla" w:hAnsi="Sakkal Majalla" w:cs="Sakkal Majalla"/>
+          <w:sz w:val="28"/>
+          <w:szCs w:val="28"/>
+        </w:rPr>
+        <w:t>*******************************************************</w:t>
+      </w:r>
+    </w:p>
+    <w:p>
+      <w:pPr>
+        <w:rPr>
+          <w:rFonts w:ascii="Sakkal Majalla" w:hAnsi="Sakkal Majalla" w:cs="Sakkal Majalla"/>
+          <w:sz w:val="28"/>
+          <w:szCs w:val="28"/>
+        </w:rPr>
+      </w:pPr>
     </w:p>
     <w:p>
       <w:pPr>

</xml_diff>